<commit_message>
Preparing Template for Protocol Doc
</commit_message>
<xml_diff>
--- a/Midterm/ParticipantResults/ProtocolForm-Participant1.docx
+++ b/Midterm/ParticipantResults/ProtocolForm-Participant1.docx
@@ -84,7 +84,13 @@
         <w:rPr>
           <w:rFonts w:asciiTheme="minorHAnsi" w:hAnsiTheme="minorHAnsi"/>
         </w:rPr>
-        <w:t xml:space="preserve">Data Visualization GUI Interactivity </w:t>
+        <w:t xml:space="preserve"> </w:t>
+      </w:r>
+      <w:r>
+        <w:rPr>
+          <w:rFonts w:asciiTheme="minorHAnsi" w:hAnsiTheme="minorHAnsi"/>
+        </w:rPr>
+        <w:t xml:space="preserve">Improved Trail-Based Selector </w:t>
       </w:r>
       <w:r>
         <w:rPr>
@@ -731,7 +737,27 @@
           <w:iCs/>
           <w:color w:val="000000"/>
         </w:rPr>
-        <w:t>The purpose of this study is to investigate user interactions with dashboard widgets, graphs, the carousel, sidebars, and the overall data visualization pipeline in a web-based AI-driven platform. By studying how participants engage with these features, we aim to improve their design and usability.</w:t>
+        <w:t xml:space="preserve">The purpose of this study is to investigate user interactions with dashboard widgets, graphs, </w:t>
+      </w:r>
+      <w:proofErr w:type="gramStart"/>
+      <w:r>
+        <w:rPr>
+          <w:rFonts w:eastAsia="Times New Roman" w:cs="Arial"/>
+          <w:i/>
+          <w:iCs/>
+          <w:color w:val="000000"/>
+        </w:rPr>
+        <w:t>the carousel</w:t>
+      </w:r>
+      <w:proofErr w:type="gramEnd"/>
+      <w:r>
+        <w:rPr>
+          <w:rFonts w:eastAsia="Times New Roman" w:cs="Arial"/>
+          <w:i/>
+          <w:iCs/>
+          <w:color w:val="000000"/>
+        </w:rPr>
+        <w:t>, sidebars, and the overall data visualization pipeline in a web-based AI-driven platform. By studying how participants engage with these features, we aim to improve their design and usability.</w:t>
       </w:r>
     </w:p>
     <w:p>
@@ -1846,16 +1872,31 @@
           <w:sz w:val="24"/>
           <w:szCs w:val="24"/>
         </w:rPr>
-        <w:t>The interface was clear, and target selection felt natural. The task flow was smooth, but smaller targets and longer distances were challenging. A sensitivity setting or clearer target highlighting could improve accuracy.</w:t>
+        <w:t xml:space="preserve">The interface was clear, and </w:t>
+      </w:r>
+      <w:proofErr w:type="gramStart"/>
+      <w:r>
+        <w:rPr>
+          <w:rFonts w:ascii="Abadi" w:eastAsia="Times New Roman" w:hAnsi="Abadi" w:cs="Arial"/>
+          <w:iCs/>
+          <w:sz w:val="24"/>
+          <w:szCs w:val="24"/>
+        </w:rPr>
+        <w:t>target</w:t>
+      </w:r>
+      <w:proofErr w:type="gramEnd"/>
+      <w:r>
+        <w:rPr>
+          <w:rFonts w:ascii="Abadi" w:eastAsia="Times New Roman" w:hAnsi="Abadi" w:cs="Arial"/>
+          <w:iCs/>
+          <w:sz w:val="24"/>
+          <w:szCs w:val="24"/>
+        </w:rPr>
+        <w:t xml:space="preserve"> selection felt natural. The task flow was smooth, but smaller targets and longer distances were challenging. A sensitivity setting or clearer target highlighting could improve accuracy.</w:t>
       </w:r>
     </w:p>
     <w:sectPr>
-      <w:headerReference w:type="even" r:id="rId7"/>
-      <w:headerReference w:type="default" r:id="rId8"/>
-      <w:footerReference w:type="even" r:id="rId9"/>
-      <w:footerReference w:type="default" r:id="rId10"/>
-      <w:headerReference w:type="first" r:id="rId11"/>
-      <w:footerReference w:type="first" r:id="rId12"/>
+      <w:headerReference w:type="default" r:id="rId7"/>
       <w:pgSz w:w="12240" w:h="15840"/>
       <w:pgMar w:top="1440" w:right="1440" w:bottom="1440" w:left="1440" w:header="720" w:footer="720" w:gutter="0"/>
       <w:cols w:space="720"/>
@@ -1890,36 +1931,6 @@
 </w:endnotes>
 </file>
 
-<file path=word/footer1.xml><?xml version="1.0" encoding="utf-8"?>
-<w:ftr xmlns:wpc="http://schemas.microsoft.com/office/word/2010/wordprocessingCanvas" xmlns:cx="http://schemas.microsoft.com/office/drawing/2014/chartex" xmlns:cx1="http://schemas.microsoft.com/office/drawing/2015/9/8/chartex" xmlns:cx2="http://schemas.microsoft.com/office/drawing/2015/10/21/chartex" xmlns:cx3="http://schemas.microsoft.com/office/drawing/2016/5/9/chartex" xmlns:cx4="http://schemas.microsoft.com/office/drawing/2016/5/10/chartex" xmlns:cx5="http://schemas.microsoft.com/office/drawing/2016/5/11/chartex" xmlns:cx6="http://schemas.microsoft.com/office/drawing/2016/5/12/chartex" xmlns:cx7="http://schemas.microsoft.com/office/drawing/2016/5/13/chartex" xmlns:cx8="http://schemas.microsoft.com/office/drawing/2016/5/14/chartex" xmlns:mc="http://schemas.openxmlformats.org/markup-compatibility/2006" xmlns:aink="http://schemas.microsoft.com/office/drawing/2016/ink" xmlns:am3d="http://schemas.microsoft.com/office/drawing/2017/model3d" xmlns:o="urn:schemas-microsoft-com:office:office" xmlns:oel="http://schemas.microsoft.com/office/2019/extlst" xmlns:r="http://schemas.openxmlformats.org/officeDocument/2006/relationships" xmlns:m="http://schemas.openxmlformats.org/officeDocument/2006/math" xmlns:v="urn:schemas-microsoft-com:vml" xmlns:wp14="http://schemas.microsoft.com/office/word/2010/wordprocessingDrawing" xmlns:wp="http://schemas.openxmlformats.org/drawingml/2006/wordprocessingDrawing" xmlns:w10="urn:schemas-microsoft-com:office:word" xmlns:w="http://schemas.openxmlformats.org/wordprocessingml/2006/main" xmlns:w14="http://schemas.microsoft.com/office/word/2010/wordml" xmlns:w15="http://schemas.microsoft.com/office/word/2012/wordml" xmlns:w16cex="http://schemas.microsoft.com/office/word/2018/wordml/cex" xmlns:w16cid="http://schemas.microsoft.com/office/word/2016/wordml/cid" xmlns:w16="http://schemas.microsoft.com/office/word/2018/wordml" xmlns:w16du="http://schemas.microsoft.com/office/word/2023/wordml/word16du" xmlns:w16sdtdh="http://schemas.microsoft.com/office/word/2020/wordml/sdtdatahash" xmlns:w16sdtfl="http://schemas.microsoft.com/office/word/2024/wordml/sdtformatlock" xmlns:w16se="http://schemas.microsoft.com/office/word/2015/wordml/symex" xmlns:wpg="http://schemas.microsoft.com/office/word/2010/wordprocessingGroup" xmlns:wpi="http://schemas.microsoft.com/office/word/2010/wordprocessingInk" xmlns:wne="http://schemas.microsoft.com/office/word/2006/wordml" xmlns:wps="http://schemas.microsoft.com/office/word/2010/wordprocessingShape" mc:Ignorable="w14 w15 w16se w16cid w16 w16cex w16sdtdh w16sdtfl w16du wp14">
-  <w:p>
-    <w:pPr>
-      <w:pStyle w:val="Footer"/>
-    </w:pPr>
-  </w:p>
-</w:ftr>
-</file>
-
-<file path=word/footer2.xml><?xml version="1.0" encoding="utf-8"?>
-<w:ftr xmlns:wpc="http://schemas.microsoft.com/office/word/2010/wordprocessingCanvas" xmlns:cx="http://schemas.microsoft.com/office/drawing/2014/chartex" xmlns:cx1="http://schemas.microsoft.com/office/drawing/2015/9/8/chartex" xmlns:cx2="http://schemas.microsoft.com/office/drawing/2015/10/21/chartex" xmlns:cx3="http://schemas.microsoft.com/office/drawing/2016/5/9/chartex" xmlns:cx4="http://schemas.microsoft.com/office/drawing/2016/5/10/chartex" xmlns:cx5="http://schemas.microsoft.com/office/drawing/2016/5/11/chartex" xmlns:cx6="http://schemas.microsoft.com/office/drawing/2016/5/12/chartex" xmlns:cx7="http://schemas.microsoft.com/office/drawing/2016/5/13/chartex" xmlns:cx8="http://schemas.microsoft.com/office/drawing/2016/5/14/chartex" xmlns:mc="http://schemas.openxmlformats.org/markup-compatibility/2006" xmlns:aink="http://schemas.microsoft.com/office/drawing/2016/ink" xmlns:am3d="http://schemas.microsoft.com/office/drawing/2017/model3d" xmlns:o="urn:schemas-microsoft-com:office:office" xmlns:oel="http://schemas.microsoft.com/office/2019/extlst" xmlns:r="http://schemas.openxmlformats.org/officeDocument/2006/relationships" xmlns:m="http://schemas.openxmlformats.org/officeDocument/2006/math" xmlns:v="urn:schemas-microsoft-com:vml" xmlns:wp14="http://schemas.microsoft.com/office/word/2010/wordprocessingDrawing" xmlns:wp="http://schemas.openxmlformats.org/drawingml/2006/wordprocessingDrawing" xmlns:w10="urn:schemas-microsoft-com:office:word" xmlns:w="http://schemas.openxmlformats.org/wordprocessingml/2006/main" xmlns:w14="http://schemas.microsoft.com/office/word/2010/wordml" xmlns:w15="http://schemas.microsoft.com/office/word/2012/wordml" xmlns:w16cex="http://schemas.microsoft.com/office/word/2018/wordml/cex" xmlns:w16cid="http://schemas.microsoft.com/office/word/2016/wordml/cid" xmlns:w16="http://schemas.microsoft.com/office/word/2018/wordml" xmlns:w16du="http://schemas.microsoft.com/office/word/2023/wordml/word16du" xmlns:w16sdtdh="http://schemas.microsoft.com/office/word/2020/wordml/sdtdatahash" xmlns:w16sdtfl="http://schemas.microsoft.com/office/word/2024/wordml/sdtformatlock" xmlns:w16se="http://schemas.microsoft.com/office/word/2015/wordml/symex" xmlns:wpg="http://schemas.microsoft.com/office/word/2010/wordprocessingGroup" xmlns:wpi="http://schemas.microsoft.com/office/word/2010/wordprocessingInk" xmlns:wne="http://schemas.microsoft.com/office/word/2006/wordml" xmlns:wps="http://schemas.microsoft.com/office/word/2010/wordprocessingShape" mc:Ignorable="w14 w15 w16se w16cid w16 w16cex w16sdtdh w16sdtfl w16du wp14">
-  <w:p>
-    <w:pPr>
-      <w:pStyle w:val="Footer"/>
-    </w:pPr>
-  </w:p>
-</w:ftr>
-</file>
-
-<file path=word/footer3.xml><?xml version="1.0" encoding="utf-8"?>
-<w:ftr xmlns:wpc="http://schemas.microsoft.com/office/word/2010/wordprocessingCanvas" xmlns:cx="http://schemas.microsoft.com/office/drawing/2014/chartex" xmlns:cx1="http://schemas.microsoft.com/office/drawing/2015/9/8/chartex" xmlns:cx2="http://schemas.microsoft.com/office/drawing/2015/10/21/chartex" xmlns:cx3="http://schemas.microsoft.com/office/drawing/2016/5/9/chartex" xmlns:cx4="http://schemas.microsoft.com/office/drawing/2016/5/10/chartex" xmlns:cx5="http://schemas.microsoft.com/office/drawing/2016/5/11/chartex" xmlns:cx6="http://schemas.microsoft.com/office/drawing/2016/5/12/chartex" xmlns:cx7="http://schemas.microsoft.com/office/drawing/2016/5/13/chartex" xmlns:cx8="http://schemas.microsoft.com/office/drawing/2016/5/14/chartex" xmlns:mc="http://schemas.openxmlformats.org/markup-compatibility/2006" xmlns:aink="http://schemas.microsoft.com/office/drawing/2016/ink" xmlns:am3d="http://schemas.microsoft.com/office/drawing/2017/model3d" xmlns:o="urn:schemas-microsoft-com:office:office" xmlns:oel="http://schemas.microsoft.com/office/2019/extlst" xmlns:r="http://schemas.openxmlformats.org/officeDocument/2006/relationships" xmlns:m="http://schemas.openxmlformats.org/officeDocument/2006/math" xmlns:v="urn:schemas-microsoft-com:vml" xmlns:wp14="http://schemas.microsoft.com/office/word/2010/wordprocessingDrawing" xmlns:wp="http://schemas.openxmlformats.org/drawingml/2006/wordprocessingDrawing" xmlns:w10="urn:schemas-microsoft-com:office:word" xmlns:w="http://schemas.openxmlformats.org/wordprocessingml/2006/main" xmlns:w14="http://schemas.microsoft.com/office/word/2010/wordml" xmlns:w15="http://schemas.microsoft.com/office/word/2012/wordml" xmlns:w16cex="http://schemas.microsoft.com/office/word/2018/wordml/cex" xmlns:w16cid="http://schemas.microsoft.com/office/word/2016/wordml/cid" xmlns:w16="http://schemas.microsoft.com/office/word/2018/wordml" xmlns:w16du="http://schemas.microsoft.com/office/word/2023/wordml/word16du" xmlns:w16sdtdh="http://schemas.microsoft.com/office/word/2020/wordml/sdtdatahash" xmlns:w16sdtfl="http://schemas.microsoft.com/office/word/2024/wordml/sdtformatlock" xmlns:w16se="http://schemas.microsoft.com/office/word/2015/wordml/symex" xmlns:wpg="http://schemas.microsoft.com/office/word/2010/wordprocessingGroup" xmlns:wpi="http://schemas.microsoft.com/office/word/2010/wordprocessingInk" xmlns:wne="http://schemas.microsoft.com/office/word/2006/wordml" xmlns:wps="http://schemas.microsoft.com/office/word/2010/wordprocessingShape" mc:Ignorable="w14 w15 w16se w16cid w16 w16cex w16sdtdh w16sdtfl w16du wp14">
-  <w:p>
-    <w:pPr>
-      <w:pStyle w:val="Footer"/>
-    </w:pPr>
-  </w:p>
-</w:ftr>
-</file>
-
 <file path=word/footnotes.xml><?xml version="1.0" encoding="utf-8"?>
 <w:footnotes xmlns:wpc="http://schemas.microsoft.com/office/word/2010/wordprocessingCanvas" xmlns:cx="http://schemas.microsoft.com/office/drawing/2014/chartex" xmlns:cx1="http://schemas.microsoft.com/office/drawing/2015/9/8/chartex" xmlns:cx2="http://schemas.microsoft.com/office/drawing/2015/10/21/chartex" xmlns:cx3="http://schemas.microsoft.com/office/drawing/2016/5/9/chartex" xmlns:cx4="http://schemas.microsoft.com/office/drawing/2016/5/10/chartex" xmlns:cx5="http://schemas.microsoft.com/office/drawing/2016/5/11/chartex" xmlns:cx6="http://schemas.microsoft.com/office/drawing/2016/5/12/chartex" xmlns:cx7="http://schemas.microsoft.com/office/drawing/2016/5/13/chartex" xmlns:cx8="http://schemas.microsoft.com/office/drawing/2016/5/14/chartex" xmlns:mc="http://schemas.openxmlformats.org/markup-compatibility/2006" xmlns:aink="http://schemas.microsoft.com/office/drawing/2016/ink" xmlns:am3d="http://schemas.microsoft.com/office/drawing/2017/model3d" xmlns:o="urn:schemas-microsoft-com:office:office" xmlns:oel="http://schemas.microsoft.com/office/2019/extlst" xmlns:r="http://schemas.openxmlformats.org/officeDocument/2006/relationships" xmlns:m="http://schemas.openxmlformats.org/officeDocument/2006/math" xmlns:v="urn:schemas-microsoft-com:vml" xmlns:wp14="http://schemas.microsoft.com/office/word/2010/wordprocessingDrawing" xmlns:wp="http://schemas.openxmlformats.org/drawingml/2006/wordprocessingDrawing" xmlns:w10="urn:schemas-microsoft-com:office:word" xmlns:w="http://schemas.openxmlformats.org/wordprocessingml/2006/main" xmlns:w14="http://schemas.microsoft.com/office/word/2010/wordml" xmlns:w15="http://schemas.microsoft.com/office/word/2012/wordml" xmlns:w16cex="http://schemas.microsoft.com/office/word/2018/wordml/cex" xmlns:w16cid="http://schemas.microsoft.com/office/word/2016/wordml/cid" xmlns:w16="http://schemas.microsoft.com/office/word/2018/wordml" xmlns:w16du="http://schemas.microsoft.com/office/word/2023/wordml/word16du" xmlns:w16sdtdh="http://schemas.microsoft.com/office/word/2020/wordml/sdtdatahash" xmlns:w16sdtfl="http://schemas.microsoft.com/office/word/2024/wordml/sdtformatlock" xmlns:w16se="http://schemas.microsoft.com/office/word/2015/wordml/symex" xmlns:wpg="http://schemas.microsoft.com/office/word/2010/wordprocessingGroup" xmlns:wpi="http://schemas.microsoft.com/office/word/2010/wordprocessingInk" xmlns:wne="http://schemas.microsoft.com/office/word/2006/wordml" xmlns:wps="http://schemas.microsoft.com/office/word/2010/wordprocessingShape" mc:Ignorable="w14 w15 w16se w16cid w16 w16cex w16sdtdh w16sdtfl w16du wp14">
   <w:footnote w:type="separator" w:id="-1">
@@ -1946,16 +1957,6 @@
 </file>
 
 <file path=word/header1.xml><?xml version="1.0" encoding="utf-8"?>
-<w:hdr xmlns:wpc="http://schemas.microsoft.com/office/word/2010/wordprocessingCanvas" xmlns:cx="http://schemas.microsoft.com/office/drawing/2014/chartex" xmlns:cx1="http://schemas.microsoft.com/office/drawing/2015/9/8/chartex" xmlns:cx2="http://schemas.microsoft.com/office/drawing/2015/10/21/chartex" xmlns:cx3="http://schemas.microsoft.com/office/drawing/2016/5/9/chartex" xmlns:cx4="http://schemas.microsoft.com/office/drawing/2016/5/10/chartex" xmlns:cx5="http://schemas.microsoft.com/office/drawing/2016/5/11/chartex" xmlns:cx6="http://schemas.microsoft.com/office/drawing/2016/5/12/chartex" xmlns:cx7="http://schemas.microsoft.com/office/drawing/2016/5/13/chartex" xmlns:cx8="http://schemas.microsoft.com/office/drawing/2016/5/14/chartex" xmlns:mc="http://schemas.openxmlformats.org/markup-compatibility/2006" xmlns:aink="http://schemas.microsoft.com/office/drawing/2016/ink" xmlns:am3d="http://schemas.microsoft.com/office/drawing/2017/model3d" xmlns:o="urn:schemas-microsoft-com:office:office" xmlns:oel="http://schemas.microsoft.com/office/2019/extlst" xmlns:r="http://schemas.openxmlformats.org/officeDocument/2006/relationships" xmlns:m="http://schemas.openxmlformats.org/officeDocument/2006/math" xmlns:v="urn:schemas-microsoft-com:vml" xmlns:wp14="http://schemas.microsoft.com/office/word/2010/wordprocessingDrawing" xmlns:wp="http://schemas.openxmlformats.org/drawingml/2006/wordprocessingDrawing" xmlns:w10="urn:schemas-microsoft-com:office:word" xmlns:w="http://schemas.openxmlformats.org/wordprocessingml/2006/main" xmlns:w14="http://schemas.microsoft.com/office/word/2010/wordml" xmlns:w15="http://schemas.microsoft.com/office/word/2012/wordml" xmlns:w16cex="http://schemas.microsoft.com/office/word/2018/wordml/cex" xmlns:w16cid="http://schemas.microsoft.com/office/word/2016/wordml/cid" xmlns:w16="http://schemas.microsoft.com/office/word/2018/wordml" xmlns:w16du="http://schemas.microsoft.com/office/word/2023/wordml/word16du" xmlns:w16sdtdh="http://schemas.microsoft.com/office/word/2020/wordml/sdtdatahash" xmlns:w16sdtfl="http://schemas.microsoft.com/office/word/2024/wordml/sdtformatlock" xmlns:w16se="http://schemas.microsoft.com/office/word/2015/wordml/symex" xmlns:wpg="http://schemas.microsoft.com/office/word/2010/wordprocessingGroup" xmlns:wpi="http://schemas.microsoft.com/office/word/2010/wordprocessingInk" xmlns:wne="http://schemas.microsoft.com/office/word/2006/wordml" xmlns:wps="http://schemas.microsoft.com/office/word/2010/wordprocessingShape" mc:Ignorable="w14 w15 w16se w16cid w16 w16cex w16sdtdh w16sdtfl w16du wp14">
-  <w:p>
-    <w:pPr>
-      <w:pStyle w:val="Header"/>
-    </w:pPr>
-  </w:p>
-</w:hdr>
-</file>
-
-<file path=word/header2.xml><?xml version="1.0" encoding="utf-8"?>
 <w:hdr xmlns:wpc="http://schemas.microsoft.com/office/word/2010/wordprocessingCanvas" xmlns:cx="http://schemas.microsoft.com/office/drawing/2014/chartex" xmlns:cx1="http://schemas.microsoft.com/office/drawing/2015/9/8/chartex" xmlns:cx2="http://schemas.microsoft.com/office/drawing/2015/10/21/chartex" xmlns:cx3="http://schemas.microsoft.com/office/drawing/2016/5/9/chartex" xmlns:cx4="http://schemas.microsoft.com/office/drawing/2016/5/10/chartex" xmlns:cx5="http://schemas.microsoft.com/office/drawing/2016/5/11/chartex" xmlns:cx6="http://schemas.microsoft.com/office/drawing/2016/5/12/chartex" xmlns:cx7="http://schemas.microsoft.com/office/drawing/2016/5/13/chartex" xmlns:cx8="http://schemas.microsoft.com/office/drawing/2016/5/14/chartex" xmlns:mc="http://schemas.openxmlformats.org/markup-compatibility/2006" xmlns:aink="http://schemas.microsoft.com/office/drawing/2016/ink" xmlns:am3d="http://schemas.microsoft.com/office/drawing/2017/model3d" xmlns:o="urn:schemas-microsoft-com:office:office" xmlns:oel="http://schemas.microsoft.com/office/2019/extlst" xmlns:r="http://schemas.openxmlformats.org/officeDocument/2006/relationships" xmlns:m="http://schemas.openxmlformats.org/officeDocument/2006/math" xmlns:v="urn:schemas-microsoft-com:vml" xmlns:wp14="http://schemas.microsoft.com/office/word/2010/wordprocessingDrawing" xmlns:wp="http://schemas.openxmlformats.org/drawingml/2006/wordprocessingDrawing" xmlns:w10="urn:schemas-microsoft-com:office:word" xmlns:w="http://schemas.openxmlformats.org/wordprocessingml/2006/main" xmlns:w14="http://schemas.microsoft.com/office/word/2010/wordml" xmlns:w15="http://schemas.microsoft.com/office/word/2012/wordml" xmlns:w16cex="http://schemas.microsoft.com/office/word/2018/wordml/cex" xmlns:w16cid="http://schemas.microsoft.com/office/word/2016/wordml/cid" xmlns:w16="http://schemas.microsoft.com/office/word/2018/wordml" xmlns:w16du="http://schemas.microsoft.com/office/word/2023/wordml/word16du" xmlns:w16sdtdh="http://schemas.microsoft.com/office/word/2020/wordml/sdtdatahash" xmlns:w16sdtfl="http://schemas.microsoft.com/office/word/2024/wordml/sdtformatlock" xmlns:w16se="http://schemas.microsoft.com/office/word/2015/wordml/symex" xmlns:wpg="http://schemas.microsoft.com/office/word/2010/wordprocessingGroup" xmlns:wpi="http://schemas.microsoft.com/office/word/2010/wordprocessingInk" xmlns:wne="http://schemas.microsoft.com/office/word/2006/wordml" xmlns:wps="http://schemas.microsoft.com/office/word/2010/wordprocessingShape" mc:Ignorable="w14 w15 w16se w16cid w16 w16cex w16sdtdh w16sdtfl w16du wp14">
   <w:tbl>
     <w:tblPr>
@@ -1981,13 +1982,7 @@
             <w:jc w:val="right"/>
           </w:pPr>
           <w:r>
-            <w:t>Data Visualization GUI</w:t>
-          </w:r>
-          <w:r>
-            <w:t xml:space="preserve"> </w:t>
-          </w:r>
-          <w:r>
-            <w:t>Study</w:t>
+            <w:t>Trail-Based Selector Study</w:t>
           </w:r>
         </w:p>
         <w:p>
@@ -2024,19 +2019,19 @@
             <w:rPr>
               <w:u w:val="single"/>
             </w:rPr>
-            <w:t>2/</w:t>
+            <w:t>3</w:t>
           </w:r>
           <w:r>
             <w:rPr>
               <w:u w:val="single"/>
             </w:rPr>
-            <w:t>2</w:t>
+            <w:t>/</w:t>
           </w:r>
           <w:r>
             <w:rPr>
               <w:u w:val="single"/>
             </w:rPr>
-            <w:t>2</w:t>
+            <w:t>20</w:t>
           </w:r>
           <w:r>
             <w:rPr>
@@ -2092,16 +2087,6 @@
       </w:tc>
     </w:tr>
   </w:tbl>
-  <w:p>
-    <w:pPr>
-      <w:pStyle w:val="Header"/>
-    </w:pPr>
-  </w:p>
-</w:hdr>
-</file>
-
-<file path=word/header3.xml><?xml version="1.0" encoding="utf-8"?>
-<w:hdr xmlns:wpc="http://schemas.microsoft.com/office/word/2010/wordprocessingCanvas" xmlns:cx="http://schemas.microsoft.com/office/drawing/2014/chartex" xmlns:cx1="http://schemas.microsoft.com/office/drawing/2015/9/8/chartex" xmlns:cx2="http://schemas.microsoft.com/office/drawing/2015/10/21/chartex" xmlns:cx3="http://schemas.microsoft.com/office/drawing/2016/5/9/chartex" xmlns:cx4="http://schemas.microsoft.com/office/drawing/2016/5/10/chartex" xmlns:cx5="http://schemas.microsoft.com/office/drawing/2016/5/11/chartex" xmlns:cx6="http://schemas.microsoft.com/office/drawing/2016/5/12/chartex" xmlns:cx7="http://schemas.microsoft.com/office/drawing/2016/5/13/chartex" xmlns:cx8="http://schemas.microsoft.com/office/drawing/2016/5/14/chartex" xmlns:mc="http://schemas.openxmlformats.org/markup-compatibility/2006" xmlns:aink="http://schemas.microsoft.com/office/drawing/2016/ink" xmlns:am3d="http://schemas.microsoft.com/office/drawing/2017/model3d" xmlns:o="urn:schemas-microsoft-com:office:office" xmlns:oel="http://schemas.microsoft.com/office/2019/extlst" xmlns:r="http://schemas.openxmlformats.org/officeDocument/2006/relationships" xmlns:m="http://schemas.openxmlformats.org/officeDocument/2006/math" xmlns:v="urn:schemas-microsoft-com:vml" xmlns:wp14="http://schemas.microsoft.com/office/word/2010/wordprocessingDrawing" xmlns:wp="http://schemas.openxmlformats.org/drawingml/2006/wordprocessingDrawing" xmlns:w10="urn:schemas-microsoft-com:office:word" xmlns:w="http://schemas.openxmlformats.org/wordprocessingml/2006/main" xmlns:w14="http://schemas.microsoft.com/office/word/2010/wordml" xmlns:w15="http://schemas.microsoft.com/office/word/2012/wordml" xmlns:w16cex="http://schemas.microsoft.com/office/word/2018/wordml/cex" xmlns:w16cid="http://schemas.microsoft.com/office/word/2016/wordml/cid" xmlns:w16="http://schemas.microsoft.com/office/word/2018/wordml" xmlns:w16du="http://schemas.microsoft.com/office/word/2023/wordml/word16du" xmlns:w16sdtdh="http://schemas.microsoft.com/office/word/2020/wordml/sdtdatahash" xmlns:w16sdtfl="http://schemas.microsoft.com/office/word/2024/wordml/sdtformatlock" xmlns:w16se="http://schemas.microsoft.com/office/word/2015/wordml/symex" xmlns:wpg="http://schemas.microsoft.com/office/word/2010/wordprocessingGroup" xmlns:wpi="http://schemas.microsoft.com/office/word/2010/wordprocessingInk" xmlns:wne="http://schemas.microsoft.com/office/word/2006/wordml" xmlns:wps="http://schemas.microsoft.com/office/word/2010/wordprocessingShape" mc:Ignorable="w14 w15 w16se w16cid w16 w16cex w16sdtdh w16sdtfl w16du wp14">
   <w:p>
     <w:pPr>
       <w:pStyle w:val="Header"/>

</xml_diff>